<commit_message>
feat: redesign the CV and fix metrics with verified GitHub data
CV (build_cv.py, PT/EN/ES, PDF and DOCX):
- One page instead of a page and a quarter, in the site's cobalt palette
- Still single column, standard fonts, standard section headings and no
  tables, images, headers or footers, so ATS parsers read it in order
- Bullets start with action verbs; dates use years everywhere
- Portfolio link added; international phone format in EN and ES
- File metadata (title, subject, keywords) filled in

Metrics, now the same on the CV and the site (GitHub search API,
quero-edu org, PRs created from 2025-10-22 to 2026-10-22):
634 opened, 540 merged, 26 repositories and 295 PRs from other people
reviewed. The previous 374 also counted the author's own PRs, and the
CV still had older numbers (~170 PRs, 97% merge rate, 74 reviews).

Site copy: about text no longer says "this year" for both products, and
labels match the CV wording.

Co-Authored-By: Claude Opus 5.5 <noreply@anthropic.com>
</commit_message>
<xml_diff>
--- a/public/cv.docx
+++ b/public/cv.docx
@@ -9,8 +9,7 @@
       <w:r>
         <w:rPr>
           <w:b/>
-          <w:color w:val="1D2350"/>
-          <w:sz w:val="48"/>
+          <w:sz w:val="44"/>
         </w:rPr>
         <w:t>Ali Mohamed Khodr</w:t>
       </w:r>
@@ -22,97 +21,95 @@
       <w:r>
         <w:rPr>
           <w:b/>
-          <w:color w:val="4F52C9"/>
-          <w:sz w:val="22"/>
+          <w:color w:val="2141CC"/>
+          <w:sz w:val="21"/>
         </w:rPr>
-        <w:t>Software Engineer | Full-stack: Vue, Nuxt, Ruby on Rails, Node.js</w:t>
+        <w:t>Software Engineer | Full-stack: Vue.js, Nuxt, TypeScript, Ruby on Rails, Node.js</w:t>
       </w:r>
     </w:p>
     <w:p>
       <w:pPr>
-        <w:spacing w:after="120"/>
+        <w:spacing w:after="80"/>
         <w:pBdr>
-          <w:bottom w:val="single" w:sz="12" w:space="2" w:color="4f52c9"/>
+          <w:bottom w:val="single" w:sz="12" w:space="2" w:color="2141CC"/>
         </w:pBdr>
       </w:pPr>
       <w:r>
         <w:rPr>
-          <w:color w:val="5B6185"/>
-          <w:sz w:val="19"/>
+          <w:color w:val="545C6A"/>
+          <w:sz w:val="18"/>
         </w:rPr>
         <w:t>São José dos Campos, SP  |  ali.m.khodr@gmail.com  |  (12) 98859-4305</w:t>
         <w:br/>
       </w:r>
       <w:r>
         <w:rPr>
-          <w:color w:val="5B6185"/>
-          <w:sz w:val="19"/>
+          <w:color w:val="545C6A"/>
+          <w:sz w:val="18"/>
         </w:rPr>
-        <w:t>linkedin.com/in/alimohamedkhodr  |  github.com/alimkhodr</w:t>
+        <w:t>linkedin.com/in/alimohamedkhodr  |  github.com/alimkhodr  |  alimkhodr.netlify.app</w:t>
       </w:r>
     </w:p>
     <w:p>
       <w:pPr>
         <w:keepNext/>
-        <w:spacing w:before="240" w:after="100"/>
+        <w:spacing w:before="180" w:after="80"/>
         <w:pBdr>
-          <w:bottom w:val="single" w:sz="6" w:space="2" w:color="d9dcf0"/>
+          <w:bottom w:val="single" w:sz="6" w:space="2" w:color="D5D9E2"/>
         </w:pBdr>
       </w:pPr>
       <w:r>
         <w:rPr>
           <w:b/>
-          <w:color w:val="4F52C9"/>
-          <w:sz w:val="21"/>
+          <w:color w:val="2141CC"/>
+          <w:sz w:val="20"/>
         </w:rPr>
         <w:t>RESUMO PROFISSIONAL</w:t>
       </w:r>
     </w:p>
     <w:p>
       <w:r>
-        <w:t>Software Engineer full-stack com experiência em construir produtos web do zero até a produção. Tech lead técnico de um gateway de pagamentos embarcável (Cartão, PIX e Boleto) e de uma área do aluno multi-tenant. Domínio de Vue, Nuxt, React, Ruby on Rails e Node.js, com prática em Docker, AWS e CI/CD. Cerca de 170 pull requests no último ano, com 97% de taxa de merge em mais de 20 repositórios.</w:t>
+        <w:t>Software Engineer full-stack com experiência em levar produtos web do zero à produção. Tech lead de um gateway de pagamentos embarcável (Cartão, PIX e Boleto) e de uma área do aluno multi-tenant na Qeevo Group. Trabalho com Vue.js, Nuxt, TypeScript, Ruby on Rails e Node.js, além de Docker, AWS e CI/CD. Nos últimos 12 meses: 634 pull requests abertos (540 mergeados) e 295 pull requests de outros desenvolvedores revisados, em 26 repositórios.</w:t>
       </w:r>
     </w:p>
     <w:p>
       <w:pPr>
         <w:keepNext/>
-        <w:spacing w:before="240" w:after="100"/>
+        <w:spacing w:before="180" w:after="80"/>
         <w:pBdr>
-          <w:bottom w:val="single" w:sz="6" w:space="2" w:color="d9dcf0"/>
+          <w:bottom w:val="single" w:sz="6" w:space="2" w:color="D5D9E2"/>
         </w:pBdr>
       </w:pPr>
       <w:r>
         <w:rPr>
           <w:b/>
-          <w:color w:val="4F52C9"/>
-          <w:sz w:val="21"/>
+          <w:color w:val="2141CC"/>
+          <w:sz w:val="20"/>
         </w:rPr>
         <w:t>COMPETÊNCIAS TÉCNICAS</w:t>
       </w:r>
     </w:p>
     <w:p>
       <w:pPr>
-        <w:spacing w:after="40"/>
+        <w:spacing w:after="20"/>
       </w:pPr>
       <w:r>
         <w:rPr>
           <w:b/>
-          <w:color w:val="1D2350"/>
         </w:rPr>
         <w:t xml:space="preserve">Linguagens: </w:t>
       </w:r>
       <w:r>
-        <w:t>TypeScript, JavaScript, Ruby, Node.js, Python, SQL, C#</w:t>
+        <w:t>TypeScript, JavaScript, Ruby, Python, SQL, C#, Visual Basic</w:t>
       </w:r>
     </w:p>
     <w:p>
       <w:pPr>
-        <w:spacing w:after="40"/>
+        <w:spacing w:after="20"/>
       </w:pPr>
       <w:r>
         <w:rPr>
           <w:b/>
-          <w:color w:val="1D2350"/>
         </w:rPr>
         <w:t xml:space="preserve">Frontend: </w:t>
       </w:r>
@@ -122,29 +119,27 @@
     </w:p>
     <w:p>
       <w:pPr>
-        <w:spacing w:after="40"/>
+        <w:spacing w:after="20"/>
       </w:pPr>
       <w:r>
         <w:rPr>
           <w:b/>
-          <w:color w:val="1D2350"/>
         </w:rPr>
         <w:t xml:space="preserve">Backend e APIs: </w:t>
       </w:r>
       <w:r>
-        <w:t>Ruby on Rails, Node.js, REST APIs, GraphQL, autenticação OAuth</w:t>
+        <w:t>Ruby on Rails, Node.js, REST APIs, GraphQL, OAuth</w:t>
       </w:r>
     </w:p>
     <w:p>
       <w:pPr>
-        <w:spacing w:after="40"/>
+        <w:spacing w:after="20"/>
       </w:pPr>
       <w:r>
         <w:rPr>
           <w:b/>
-          <w:color w:val="1D2350"/>
         </w:rPr>
-        <w:t xml:space="preserve">Infraestrutura: </w:t>
+        <w:t xml:space="preserve">Infraestrutura e DevOps: </w:t>
       </w:r>
       <w:r>
         <w:t>Docker, AWS, CI/CD, GitHub Actions, Linux, Netlify, Vercel</w:t>
@@ -152,12 +147,11 @@
     </w:p>
     <w:p>
       <w:pPr>
-        <w:spacing w:after="40"/>
+        <w:spacing w:after="20"/>
       </w:pPr>
       <w:r>
         <w:rPr>
           <w:b/>
-          <w:color w:val="1D2350"/>
         </w:rPr>
         <w:t xml:space="preserve">Dados: </w:t>
       </w:r>
@@ -167,47 +161,31 @@
     </w:p>
     <w:p>
       <w:pPr>
-        <w:spacing w:after="40"/>
+        <w:spacing w:after="20"/>
       </w:pPr>
       <w:r>
         <w:rPr>
           <w:b/>
-          <w:color w:val="1D2350"/>
         </w:rPr>
-        <w:t xml:space="preserve">Domínios: </w:t>
+        <w:t xml:space="preserve">Domínios e práticas: </w:t>
       </w:r>
       <w:r>
-        <w:t>Pagamentos (gateway embarcável, Cartão, PIX, PIX recorrente, Boleto, reembolso), arquitetura multi-tenant, design systems, testes A/B</w:t>
-      </w:r>
-    </w:p>
-    <w:p>
-      <w:pPr>
-        <w:spacing w:after="40"/>
-      </w:pPr>
-      <w:r>
-        <w:rPr>
-          <w:b/>
-          <w:color w:val="1D2350"/>
-        </w:rPr>
-        <w:t xml:space="preserve">Práticas e ferramentas: </w:t>
-      </w:r>
-      <w:r>
-        <w:t>Code review, testes automatizados, Git, monorepos, metodologias ágeis, Claude Code</w:t>
+        <w:t>Pagamentos (Cartão, PIX, PIX recorrente, Boleto, reembolso), arquitetura multi-tenant, design systems, testes A/B, code review, testes automatizados, Git, metodologias ágeis, Claude Code</w:t>
       </w:r>
     </w:p>
     <w:p>
       <w:pPr>
         <w:keepNext/>
-        <w:spacing w:before="240" w:after="100"/>
+        <w:spacing w:before="180" w:after="80"/>
         <w:pBdr>
-          <w:bottom w:val="single" w:sz="6" w:space="2" w:color="d9dcf0"/>
+          <w:bottom w:val="single" w:sz="6" w:space="2" w:color="D5D9E2"/>
         </w:pBdr>
       </w:pPr>
       <w:r>
         <w:rPr>
           <w:b/>
-          <w:color w:val="4F52C9"/>
-          <w:sz w:val="21"/>
+          <w:color w:val="2141CC"/>
+          <w:sz w:val="20"/>
         </w:rPr>
         <w:t>EXPERIÊNCIA PROFISSIONAL</w:t>
       </w:r>
@@ -215,39 +193,41 @@
     <w:p>
       <w:pPr>
         <w:keepNext/>
-        <w:spacing w:before="120" w:after="0"/>
+        <w:spacing w:before="100" w:after="0"/>
       </w:pPr>
       <w:r>
         <w:rPr>
           <w:b/>
-          <w:sz w:val="23"/>
+          <w:sz w:val="21"/>
         </w:rPr>
         <w:t>Qeevo Group (ex-Quero Educação)</w:t>
       </w:r>
       <w:r>
         <w:rPr>
-          <w:color w:val="5B6185"/>
+          <w:color w:val="545C6A"/>
+          <w:sz w:val="18"/>
         </w:rPr>
-        <w:t xml:space="preserve">   São José dos Campos, SP</w:t>
+        <w:t xml:space="preserve">  |  São José dos Campos, SP</w:t>
       </w:r>
     </w:p>
     <w:p>
       <w:pPr>
         <w:keepNext/>
-        <w:spacing w:before="80" w:after="40"/>
+        <w:spacing w:before="60" w:after="20"/>
       </w:pPr>
       <w:r>
         <w:rPr>
           <w:b/>
-          <w:color w:val="4F52C9"/>
+          <w:color w:val="2141CC"/>
         </w:rPr>
         <w:t>Software Engineer</w:t>
       </w:r>
       <w:r>
         <w:rPr>
-          <w:color w:val="5B6185"/>
+          <w:color w:val="545C6A"/>
+          <w:sz w:val="18"/>
         </w:rPr>
-        <w:t xml:space="preserve">   2025 - atual</w:t>
+        <w:t xml:space="preserve">  |  2025 - atual</w:t>
       </w:r>
     </w:p>
     <w:p>
@@ -255,7 +235,7 @@
         <w:pStyle w:val="ListBullet"/>
       </w:pPr>
       <w:r>
-        <w:t>Tech lead técnico na construção do zero de um gateway de pagamentos embarcável via iframe para parceiros, com fluxos de Cartão, PIX e Boleto, cupons, temas por marca, CI/CD e dockerização (cerca de 33 pull requests entre backend e frontend).</w:t>
+        <w:t>Liderei tecnicamente a construção do zero de um gateway de pagamentos embarcável via iframe para parceiros: Cartão, PIX e Boleto, cupons, temas por marca, CI/CD e Docker (cerca de 33 pull requests entre backend e frontend).</w:t>
       </w:r>
     </w:p>
     <w:p>
@@ -263,7 +243,7 @@
         <w:pStyle w:val="ListBullet"/>
       </w:pPr>
       <w:r>
-        <w:t>Liderança técnica de uma área do aluno multi-tenant construída do zero: histórico de pagamentos, reembolso self-service, validação de chave PIX e localização por tenant.</w:t>
+        <w:t>Liderei a área do aluno multi-tenant, também criada do zero: histórico de pagamentos, reembolso self-service, validação de chave PIX e localização por tenant (cerca de 24 pull requests como owner técnico do produto).</w:t>
       </w:r>
     </w:p>
     <w:p>
@@ -271,7 +251,7 @@
         <w:pStyle w:val="ListBullet"/>
       </w:pPr>
       <w:r>
-        <w:t>Coordenação de um fluxo de reembolso ponta a ponta em mais de 6 repositórios e múltiplos times, com reembolso via PIX, fallback automático por e-mail e painel de auditoria.</w:t>
+        <w:t>Coordenei um fluxo de reembolso ponta a ponta em mais de 6 repositórios e vários times, com reembolso via PIX, fallback automático por e-mail e painel de auditoria.</w:t>
       </w:r>
     </w:p>
     <w:p>
@@ -279,7 +259,7 @@
         <w:pStyle w:val="ListBullet"/>
       </w:pPr>
       <w:r>
-        <w:t>Habilitação de PIX recorrente como método de assinatura, do controller no monolito ao modal de pagamento no frontend.</w:t>
+        <w:t>Habilitei o PIX recorrente como método de pagamento de assinaturas, do controller no monolito Ruby ao modal de pagamento no frontend.</w:t>
       </w:r>
     </w:p>
     <w:p>
@@ -287,39 +267,39 @@
         <w:pStyle w:val="ListBullet"/>
       </w:pPr>
       <w:r>
-        <w:t>Contribuição ao design system compartilhado da organização, 74 code reviews no período e experimentos A/B em cross-sell pós-checkout.</w:t>
+        <w:t>Revisei 295 pull requests de outros desenvolvedores nos últimos 12 meses, contribuí com o design system compartilhado da organização e implementei testes A/B de cross-sell pós-checkout.</w:t>
       </w:r>
     </w:p>
     <w:p>
       <w:pPr>
-        <w:spacing w:after="80"/>
+        <w:spacing w:after="60"/>
       </w:pPr>
       <w:r>
         <w:rPr>
-          <w:i/>
-          <w:color w:val="5B6185"/>
-          <w:sz w:val="19"/>
+          <w:color w:val="545C6A"/>
+          <w:sz w:val="18"/>
         </w:rPr>
-        <w:t>Tecnologias: Vue, Nuxt, TypeScript, Ruby on Rails, Node.js, Docker, AWS, PostgreSQL, CI/CD</w:t>
+        <w:t>Tecnologias: Vue.js, Nuxt, TypeScript, Ruby on Rails, Node.js, Docker, AWS, PostgreSQL, CI/CD</w:t>
       </w:r>
     </w:p>
     <w:p>
       <w:pPr>
         <w:keepNext/>
-        <w:spacing w:before="80" w:after="40"/>
+        <w:spacing w:before="60" w:after="20"/>
       </w:pPr>
       <w:r>
         <w:rPr>
           <w:b/>
-          <w:color w:val="4F52C9"/>
+          <w:color w:val="2141CC"/>
         </w:rPr>
         <w:t>Desenvolvedor Full-stack</w:t>
       </w:r>
       <w:r>
         <w:rPr>
-          <w:color w:val="5B6185"/>
+          <w:color w:val="545C6A"/>
+          <w:sz w:val="18"/>
         </w:rPr>
-        <w:t xml:space="preserve">   2024 - 2025</w:t>
+        <w:t xml:space="preserve">  |  2024 - 2025</w:t>
       </w:r>
     </w:p>
     <w:p>
@@ -327,7 +307,7 @@
         <w:pStyle w:val="ListBullet"/>
       </w:pPr>
       <w:r>
-        <w:t>Desenvolvimento de funcionalidades full-stack em marketplace de educação com múltiplas marcas e tenants.</w:t>
+        <w:t>Desenvolvi funcionalidades full-stack em um marketplace de educação com múltiplas marcas e tenants.</w:t>
       </w:r>
     </w:p>
     <w:p>
@@ -335,58 +315,59 @@
         <w:pStyle w:val="ListBullet"/>
       </w:pPr>
       <w:r>
-        <w:t>Reformulação do layout das páginas de pagamento de assinatura e implementação de cross-sell multi-oferta no pós-checkout, com controle de estado via cookies.</w:t>
+        <w:t>Reformulei as páginas de pagamento de assinatura e implementei cross-sell multi-oferta no pós-checkout, com estado controlado por cookies.</w:t>
       </w:r>
     </w:p>
     <w:p>
       <w:pPr>
-        <w:spacing w:after="80"/>
+        <w:spacing w:after="60"/>
       </w:pPr>
       <w:r>
         <w:rPr>
-          <w:i/>
-          <w:color w:val="5B6185"/>
-          <w:sz w:val="19"/>
+          <w:color w:val="545C6A"/>
+          <w:sz w:val="18"/>
         </w:rPr>
-        <w:t>Tecnologias: Vue, React, Nuxt, Ruby, AWS, Docker</w:t>
+        <w:t>Tecnologias: Vue.js, React, Nuxt, Ruby, AWS, Docker</w:t>
       </w:r>
     </w:p>
     <w:p>
       <w:pPr>
         <w:keepNext/>
-        <w:spacing w:before="120" w:after="0"/>
+        <w:spacing w:before="100" w:after="0"/>
       </w:pPr>
       <w:r>
         <w:rPr>
           <w:b/>
-          <w:sz w:val="23"/>
+          <w:sz w:val="21"/>
         </w:rPr>
         <w:t>APTIV</w:t>
       </w:r>
       <w:r>
         <w:rPr>
-          <w:color w:val="5B6185"/>
+          <w:color w:val="545C6A"/>
+          <w:sz w:val="18"/>
         </w:rPr>
-        <w:t xml:space="preserve">   São José dos Campos, SP</w:t>
+        <w:t xml:space="preserve">  |  São José dos Campos, SP</w:t>
       </w:r>
     </w:p>
     <w:p>
       <w:pPr>
         <w:keepNext/>
-        <w:spacing w:before="80" w:after="40"/>
+        <w:spacing w:before="60" w:after="20"/>
       </w:pPr>
       <w:r>
         <w:rPr>
           <w:b/>
-          <w:color w:val="4F52C9"/>
+          <w:color w:val="2141CC"/>
         </w:rPr>
         <w:t>Desenvolvedor de Ferramentas Internas</w:t>
       </w:r>
       <w:r>
         <w:rPr>
-          <w:color w:val="5B6185"/>
+          <w:color w:val="545C6A"/>
+          <w:sz w:val="18"/>
         </w:rPr>
-        <w:t xml:space="preserve">   2022 - 2024</w:t>
+        <w:t xml:space="preserve">  |  2022 - 2024</w:t>
       </w:r>
     </w:p>
     <w:p>
@@ -394,7 +375,7 @@
         <w:pStyle w:val="ListBullet"/>
       </w:pPr>
       <w:r>
-        <w:t>Desenvolvimento de ferramentas internas e automações de processos industriais, com integração a bancos SQL Server em produção.</w:t>
+        <w:t>Desenvolvi ferramentas internas e automações de processos industriais integradas a bancos SQL Server em produção.</w:t>
       </w:r>
     </w:p>
     <w:p>
@@ -402,18 +383,17 @@
         <w:pStyle w:val="ListBullet"/>
       </w:pPr>
       <w:r>
-        <w:t>Apresentação de projeto interno de três meses para a liderança, com reconhecimento formal.</w:t>
+        <w:t>Apresentei à liderança um projeto interno de três meses, com reconhecimento formal.</w:t>
       </w:r>
     </w:p>
     <w:p>
       <w:pPr>
-        <w:spacing w:after="80"/>
+        <w:spacing w:after="60"/>
       </w:pPr>
       <w:r>
         <w:rPr>
-          <w:i/>
-          <w:color w:val="5B6185"/>
-          <w:sz w:val="19"/>
+          <w:color w:val="545C6A"/>
+          <w:sz w:val="18"/>
         </w:rPr>
         <w:t>Tecnologias: Visual Basic, C#, SQL, React, Node.js, Docker</w:t>
       </w:r>
@@ -421,104 +401,18 @@
     <w:p>
       <w:pPr>
         <w:keepNext/>
-        <w:spacing w:before="240" w:after="100"/>
+        <w:spacing w:before="180" w:after="80"/>
         <w:pBdr>
-          <w:bottom w:val="single" w:sz="6" w:space="2" w:color="d9dcf0"/>
+          <w:bottom w:val="single" w:sz="6" w:space="2" w:color="D5D9E2"/>
         </w:pBdr>
       </w:pPr>
       <w:r>
         <w:rPr>
           <w:b/>
-          <w:color w:val="4F52C9"/>
-          <w:sz w:val="21"/>
+          <w:color w:val="2141CC"/>
+          <w:sz w:val="20"/>
         </w:rPr>
         <w:t>FORMAÇÃO ACADÊMICA</w:t>
-      </w:r>
-    </w:p>
-    <w:p>
-      <w:pPr>
-        <w:spacing w:after="80"/>
-      </w:pPr>
-      <w:r>
-        <w:rPr>
-          <w:b/>
-        </w:rPr>
-        <w:t>Análise e Desenvolvimento de Sistemas</w:t>
-      </w:r>
-      <w:r>
-        <w:br/>
-      </w:r>
-      <w:r>
-        <w:t>Universidade do Vale do Paraíba (Univap)</w:t>
-      </w:r>
-      <w:r>
-        <w:rPr>
-          <w:color w:val="5B6185"/>
-        </w:rPr>
-        <w:t xml:space="preserve">   03/2023 - 10/2025  |  Concluído</w:t>
-      </w:r>
-    </w:p>
-    <w:p>
-      <w:pPr>
-        <w:spacing w:after="80"/>
-      </w:pPr>
-      <w:r>
-        <w:rPr>
-          <w:b/>
-        </w:rPr>
-        <w:t>Banco de Dados (Tecnólogo)</w:t>
-      </w:r>
-      <w:r>
-        <w:br/>
-      </w:r>
-      <w:r>
-        <w:t>Fatec São José dos Campos</w:t>
-      </w:r>
-      <w:r>
-        <w:rPr>
-          <w:color w:val="5B6185"/>
-        </w:rPr>
-        <w:t xml:space="preserve">   2022 - atual</w:t>
-      </w:r>
-    </w:p>
-    <w:p>
-      <w:pPr>
-        <w:spacing w:after="80"/>
-      </w:pPr>
-      <w:r>
-        <w:rPr>
-          <w:b/>
-        </w:rPr>
-        <w:t>Técnico em Desenvolvimento de Sistemas</w:t>
-      </w:r>
-      <w:r>
-        <w:br/>
-      </w:r>
-      <w:r>
-        <w:t>ETEC Profª Ilza Nascimento Pintus</w:t>
-      </w:r>
-      <w:r>
-        <w:rPr>
-          <w:color w:val="5B6185"/>
-        </w:rPr>
-        <w:t xml:space="preserve">   2019 - 2021</w:t>
-      </w:r>
-    </w:p>
-    <w:p>
-      <w:pPr>
-        <w:keepNext/>
-        <w:spacing w:before="240" w:after="100"/>
-        <w:pBdr>
-          <w:bottom w:val="single" w:sz="6" w:space="2" w:color="d9dcf0"/>
-        </w:pBdr>
-      </w:pPr>
-      <w:r>
-        <w:rPr>
-          <w:b/>
-          <w:color w:val="4F52C9"/>
-          <w:sz w:val="21"/>
-        </w:rPr>
-        <w:t>IDIOMAS</w:t>
       </w:r>
     </w:p>
     <w:p>
@@ -529,10 +423,14 @@
         <w:rPr>
           <w:b/>
         </w:rPr>
-        <w:t xml:space="preserve">Português: </w:t>
+        <w:t>Análise e Desenvolvimento de Sistemas</w:t>
       </w:r>
       <w:r>
-        <w:t>nativo</w:t>
+        <w:rPr>
+          <w:color w:val="545C6A"/>
+          <w:sz w:val="18"/>
+        </w:rPr>
+        <w:t xml:space="preserve">  |  Universidade do Vale do Paraíba (Univap)  |  2023 - 2025, concluído</w:t>
       </w:r>
     </w:p>
     <w:p>
@@ -543,15 +441,59 @@
         <w:rPr>
           <w:b/>
         </w:rPr>
-        <w:t xml:space="preserve">Inglês: </w:t>
+        <w:t>Banco de Dados (Tecnólogo)</w:t>
       </w:r>
       <w:r>
-        <w:t>avançado (C1), leitura, escrita e conversação</w:t>
+        <w:rPr>
+          <w:color w:val="545C6A"/>
+          <w:sz w:val="18"/>
+        </w:rPr>
+        <w:t xml:space="preserve">  |  Fatec São José dos Campos  |  2022 - atual</w:t>
+      </w:r>
+    </w:p>
+    <w:p>
+      <w:pPr>
+        <w:spacing w:after="40"/>
+      </w:pPr>
+      <w:r>
+        <w:rPr>
+          <w:b/>
+        </w:rPr>
+        <w:t>Técnico em Desenvolvimento de Sistemas</w:t>
+      </w:r>
+      <w:r>
+        <w:rPr>
+          <w:color w:val="545C6A"/>
+          <w:sz w:val="18"/>
+        </w:rPr>
+        <w:t xml:space="preserve">  |  ETEC Profª Ilza Nascimento Pintus  |  2019 - 2021</w:t>
+      </w:r>
+    </w:p>
+    <w:p>
+      <w:pPr>
+        <w:keepNext/>
+        <w:spacing w:before="180" w:after="80"/>
+        <w:pBdr>
+          <w:bottom w:val="single" w:sz="6" w:space="2" w:color="D5D9E2"/>
+        </w:pBdr>
+      </w:pPr>
+      <w:r>
+        <w:rPr>
+          <w:b/>
+          <w:color w:val="2141CC"/>
+          <w:sz w:val="20"/>
+        </w:rPr>
+        <w:t>IDIOMAS</w:t>
+      </w:r>
+    </w:p>
+    <w:p>
+      <w:r>
+        <w:t>Português: nativo  |  Inglês: avançado (C1)</w:t>
       </w:r>
     </w:p>
     <w:sectPr>
-      <w:pgSz w:w="12240" w:h="15840"/>
-      <w:pgMar w:top="907" w:right="1134" w:bottom="907" w:left="1134" w:header="720" w:footer="720" w:gutter="0"/>
+      <w:pgSz w:w="11906" w:h="16838"/>
+      <w:pgMar w:top="737" w:right="964" w:bottom="737" w:left="964" w:header="720" w:footer="720" w:gutter="0"/>
       <w:cols w:space="720"/>
       <w:docGrid w:linePitch="360"/>
     </w:sectPr>
@@ -923,12 +865,12 @@
     <w:qFormat/>
     <w:rsid w:val="00FC693F"/>
     <w:pPr>
-      <w:spacing w:after="60" w:line="276" w:lineRule="auto"/>
+      <w:spacing w:after="40" w:line="264" w:lineRule="auto"/>
     </w:pPr>
     <w:rPr>
       <w:rFonts w:ascii="Calibri" w:hAnsi="Calibri"/>
-      <w:color w:val="1D2350"/>
-      <w:sz w:val="21"/>
+      <w:color w:val="14161A"/>
+      <w:sz w:val="20"/>
     </w:rPr>
   </w:style>
   <w:style w:type="paragraph" w:styleId="Header">
@@ -1457,7 +1399,7 @@
       <w:numPr>
         <w:numId w:val="1"/>
       </w:numPr>
-      <w:spacing w:after="40"/>
+      <w:spacing w:after="20"/>
       <w:contextualSpacing/>
     </w:pPr>
     <w:rPr>

</xml_diff>

<commit_message>
feat: align roles with LinkedIn and add brand assets
Roles and dates now match the LinkedIn profile, on the PT, EN and ES
CVs and on the three site languages:
- Qeevo Group: a single Software Engineer role since 11/2024, with the
  former full-stack bullets merged into it
- APTIV: Software Engineer internship, 04/2023 to 11/2024, Jambeiro, SP;
  the site shows the internship as a badge next to the dates
- Fatec: 02/2022 to 12/2025
- CV dates use MM/YYYY everywhere; about text no longer mentions a
  first job

Brand assets (brand/):
- linkedin-banner.html/png (1584x396) in the site's visual language
- og-image.html and public/og-image.png (1200x630), now the og:image and
  twitter:image, since some link previews do not read WebP
- linkedin.md with the profile copy applied on LinkedIn

Co-Authored-By: Claude Opus 5.5 <noreply@anthropic.com>
</commit_message>
<xml_diff>
--- a/public/cv.docx
+++ b/public/cv.docx
@@ -227,7 +227,7 @@
           <w:color w:val="545C6A"/>
           <w:sz w:val="18"/>
         </w:rPr>
-        <w:t xml:space="preserve">  |  2025 - atual</w:t>
+        <w:t xml:space="preserve">  |  11/2024 - atual</w:t>
       </w:r>
     </w:p>
     <w:p>
@@ -272,46 +272,6 @@
     </w:p>
     <w:p>
       <w:pPr>
-        <w:spacing w:after="60"/>
-      </w:pPr>
-      <w:r>
-        <w:rPr>
-          <w:color w:val="545C6A"/>
-          <w:sz w:val="18"/>
-        </w:rPr>
-        <w:t>Tecnologias: Vue.js, Nuxt, TypeScript, Ruby on Rails, Node.js, Docker, AWS, PostgreSQL, CI/CD</w:t>
-      </w:r>
-    </w:p>
-    <w:p>
-      <w:pPr>
-        <w:keepNext/>
-        <w:spacing w:before="60" w:after="20"/>
-      </w:pPr>
-      <w:r>
-        <w:rPr>
-          <w:b/>
-          <w:color w:val="2141CC"/>
-        </w:rPr>
-        <w:t>Desenvolvedor Full-stack</w:t>
-      </w:r>
-      <w:r>
-        <w:rPr>
-          <w:color w:val="545C6A"/>
-          <w:sz w:val="18"/>
-        </w:rPr>
-        <w:t xml:space="preserve">  |  2024 - 2025</w:t>
-      </w:r>
-    </w:p>
-    <w:p>
-      <w:pPr>
-        <w:pStyle w:val="ListBullet"/>
-      </w:pPr>
-      <w:r>
-        <w:t>Desenvolvi funcionalidades full-stack em um marketplace de educação com múltiplas marcas e tenants.</w:t>
-      </w:r>
-    </w:p>
-    <w:p>
-      <w:pPr>
         <w:pStyle w:val="ListBullet"/>
       </w:pPr>
       <w:r>
@@ -327,7 +287,7 @@
           <w:color w:val="545C6A"/>
           <w:sz w:val="18"/>
         </w:rPr>
-        <w:t>Tecnologias: Vue.js, React, Nuxt, Ruby, AWS, Docker</w:t>
+        <w:t>Tecnologias: Vue.js, Nuxt, TypeScript, React, Ruby on Rails, Node.js, Docker, AWS, PostgreSQL, CI/CD</w:t>
       </w:r>
     </w:p>
     <w:p>
@@ -347,7 +307,7 @@
           <w:color w:val="545C6A"/>
           <w:sz w:val="18"/>
         </w:rPr>
-        <w:t xml:space="preserve">  |  São José dos Campos, SP</w:t>
+        <w:t xml:space="preserve">  |  Jambeiro, SP</w:t>
       </w:r>
     </w:p>
     <w:p>
@@ -360,14 +320,14 @@
           <w:b/>
           <w:color w:val="2141CC"/>
         </w:rPr>
-        <w:t>Desenvolvedor de Ferramentas Internas</w:t>
+        <w:t>Engenheiro de Software (estágio)</w:t>
       </w:r>
       <w:r>
         <w:rPr>
           <w:color w:val="545C6A"/>
           <w:sz w:val="18"/>
         </w:rPr>
-        <w:t xml:space="preserve">  |  2022 - 2024</w:t>
+        <w:t xml:space="preserve">  |  04/2023 - 11/2024</w:t>
       </w:r>
     </w:p>
     <w:p>
@@ -430,7 +390,7 @@
           <w:color w:val="545C6A"/>
           <w:sz w:val="18"/>
         </w:rPr>
-        <w:t xml:space="preserve">  |  Universidade do Vale do Paraíba (Univap)  |  2023 - 2025, concluído</w:t>
+        <w:t xml:space="preserve">  |  Universidade do Vale do Paraíba (Univap)  |  03/2023 - 10/2025, concluído</w:t>
       </w:r>
     </w:p>
     <w:p>
@@ -448,7 +408,7 @@
           <w:color w:val="545C6A"/>
           <w:sz w:val="18"/>
         </w:rPr>
-        <w:t xml:space="preserve">  |  Fatec São José dos Campos  |  2022 - atual</w:t>
+        <w:t xml:space="preserve">  |  Fatec São José dos Campos  |  02/2022 - 12/2025</w:t>
       </w:r>
     </w:p>
     <w:p>
@@ -466,7 +426,7 @@
           <w:color w:val="545C6A"/>
           <w:sz w:val="18"/>
         </w:rPr>
-        <w:t xml:space="preserve">  |  ETEC Profª Ilza Nascimento Pintus  |  2019 - 2021</w:t>
+        <w:t xml:space="preserve">  |  ETEC Profª Ilza Nascimento Pintus  |  02/2019 - 12/2021</w:t>
       </w:r>
     </w:p>
     <w:p>

</xml_diff>